<commit_message>
2.3-2.6: VSEPR, propanon-propanal, metilpropan, hidrokarbon uzay dolgu ve karbon turleri gorselleri baski boyutunda
</commit_message>
<xml_diff>
--- a/Kim12-2-3-Molekul-Geometrisi.docx
+++ b/Kim12-2-3-Molekul-Geometrisi.docx
@@ -5570,7 +5570,7 @@
       <w:r>
         <w:drawing>
           <wp:inline distT="0" distB="0" distL="0" distR="0">
-            <wp:extent cx="5760000" cy="1285253"/>
+            <wp:extent cx="4495808" cy="1136906"/>
             <wp:docPr id="900005" name="Grafik 900005" descr="VSEPR geometrileri top-çubuk (BeF2, BCl3, CF4, NCl3, OF2)"/>
             <wp:cNvGraphicFramePr>
               <a:graphicFrameLocks noChangeAspect="1"/>
@@ -5591,7 +5591,7 @@
                   <pic:spPr>
                     <a:xfrm>
                       <a:off x="0" y="0"/>
-                      <a:ext cx="5760000" cy="1285253"/>
+                      <a:ext cx="4495808" cy="1136906"/>
                     </a:xfrm>
                     <a:prstGeom prst="rect">
                       <a:avLst/>

</xml_diff>

<commit_message>
Kim12-2-3-Molekul-Geometrisi: gorsel alanlarina Shutter onizlemeleri yerlestirildi (2.3 bicimi)
</commit_message>
<xml_diff>
--- a/Kim12-2-3-Molekul-Geometrisi.docx
+++ b/Kim12-2-3-Molekul-Geometrisi.docx
@@ -99,85 +99,59 @@
         <w:t xml:space="preserve"> molekülleri aynı şekle mi sahiptir? Bu soruların cevabını bir etkinlik yaparak keşfediniz. Analiz ve Keşif Atölyesi 2.3.’te çıkarım yapacaksınız: Hibrit orbitallerin uzaydaki yönelimlerinden yola çıkarak molekül geometrilerine ilişkin varsayımda bulunacak, aynı sayıda atom içeren moleküllerin geometrilerindeki örüntüleri listeleyecek, belirlediğiniz geometrileri uzay dolgu modelleriyle karşılaştıracak, molekül geometrisinin oluşumuna ilişkin önermeler sunacak ve bu önermeleri VSEPR kuramı üzerinden değerlendireceksiniz. Fikirlerinizi grubunuzla paylaşırken iletişim becerilerinizi, molekülleri dijital araçlarla incelerken dijital ve görsel okuryazarlığınızı kullanacak; önermelerinizi güvenilir bilgilerle eleştirel bir bakışla sınayarak araştırmacı ve sorgulayıcı tutumunuzu güçlendireceksiniz.</w:t>
       </w:r>
     </w:p>
-    <w:tbl>
-      <w:tblPr>
-        <w:tblW w:w="9000" w:type="dxa"/>
+    <w:p>
+      <w:pPr>
         <w:jc w:val="center"/>
-        <w:tblBorders>
-          <w:top w:val="single" w:sz="8" w:space="0" w:color="7F7F7F"/>
-          <w:left w:val="single" w:sz="8" w:space="0" w:color="7F7F7F"/>
-          <w:bottom w:val="single" w:sz="8" w:space="0" w:color="7F7F7F"/>
-          <w:right w:val="single" w:sz="8" w:space="0" w:color="7F7F7F"/>
-        </w:tblBorders>
-      </w:tblPr>
-      <w:tblGrid>
-        <w:gridCol w:w="9000"/>
-      </w:tblGrid>
-      <w:tr>
-        <w:tc>
-          <w:tcPr>
-            <w:tcW w:w="9000" w:type="dxa"/>
-            <w:shd w:val="clear" w:color="auto" w:fill="EDEDED"/>
-          </w:tcPr>
-          <w:p>
-            <w:pPr>
-              <w:jc w:val="both"/>
-              <w:rPr>
-                <w:rFonts w:ascii="Times New Roman" w:hAnsi="Times New Roman" w:cs="Times New Roman"/>
-                <w:lang w:val="tr-TR"/>
-              </w:rPr>
-            </w:pPr>
-            <w:r>
-              <w:rPr>
-                <w:rFonts w:ascii="Times New Roman" w:hAnsi="Times New Roman" w:cs="Times New Roman"/>
-                <w:lang w:val="tr-TR"/>
-              </w:rPr>
-              <w:t xml:space="preserve">GÖRSEL ALANI (Shutterstock)</w:t>
-            </w:r>
-          </w:p>
-          <w:p>
-            <w:pPr>
-              <w:jc w:val="both"/>
-              <w:rPr>
-                <w:rFonts w:ascii="Times New Roman" w:hAnsi="Times New Roman" w:cs="Times New Roman"/>
-                <w:lang w:val="tr-TR"/>
-              </w:rPr>
-            </w:pPr>
-            <w:r>
-              <w:rPr>
-                <w:rFonts w:ascii="Times New Roman" w:hAnsi="Times New Roman" w:cs="Times New Roman"/>
-                <w:lang w:val="tr-TR"/>
-              </w:rPr>
-              <w:t xml:space="preserve">Tarif: Koyu zemin üzerinde altı kollu simetrik bir kar tanesinin makro fotoğrafı.</w:t>
-            </w:r>
-          </w:p>
-          <w:p>
-            <w:pPr>
-              <w:jc w:val="both"/>
-              <w:rPr>
-                <w:rFonts w:ascii="Times New Roman" w:hAnsi="Times New Roman" w:cs="Times New Roman"/>
-                <w:lang w:val="tr-TR"/>
-              </w:rPr>
-            </w:pPr>
-            <w:r>
-              <w:rPr>
-                <w:rFonts w:ascii="Times New Roman" w:hAnsi="Times New Roman" w:cs="Times New Roman"/>
-                <w:lang w:val="tr-TR"/>
-              </w:rPr>
-              <w:t xml:space="preserve">Shutter ID: 2689872167 (fotoğraf) — Snowflake macro, water crystals</w:t>
-            </w:r>
-          </w:p>
-        </w:tc>
-      </w:tr>
-    </w:tbl>
+      </w:pPr>
+      <w:r>
+        <w:drawing>
+          <wp:inline xmlns:a="http://schemas.openxmlformats.org/drawingml/2006/main" xmlns:pic="http://schemas.openxmlformats.org/drawingml/2006/picture">
+            <wp:extent cx="3436363" cy="2520000"/>
+            <wp:docPr id="900013" name="Picture 900013"/>
+            <wp:cNvGraphicFramePr>
+              <a:graphicFrameLocks noChangeAspect="1"/>
+            </wp:cNvGraphicFramePr>
+            <a:graphic>
+              <a:graphicData uri="http://schemas.openxmlformats.org/drawingml/2006/picture">
+                <pic:pic>
+                  <pic:nvPicPr>
+                    <pic:cNvPr id="0" name="2689872167_d.jpg"/>
+                    <pic:cNvPicPr/>
+                  </pic:nvPicPr>
+                  <pic:blipFill>
+                    <a:blip r:embed="rId11"/>
+                    <a:stretch>
+                      <a:fillRect/>
+                    </a:stretch>
+                  </pic:blipFill>
+                  <pic:spPr>
+                    <a:xfrm>
+                      <a:off x="0" y="0"/>
+                      <a:ext cx="3436363" cy="2520000"/>
+                    </a:xfrm>
+                    <a:prstGeom prst="rect"/>
+                  </pic:spPr>
+                </pic:pic>
+              </a:graphicData>
+            </a:graphic>
+          </wp:inline>
+        </w:drawing>
+      </w:r>
+    </w:p>
     <w:p>
       <w:pPr>
-        <w:jc w:val="both"/>
-        <w:rPr>
-          <w:rFonts w:ascii="Times New Roman" w:hAnsi="Times New Roman" w:cs="Times New Roman"/>
-          <w:lang w:val="tr-TR"/>
-        </w:rPr>
-      </w:pPr>
+        <w:jc w:val="center"/>
+      </w:pPr>
+      <w:r>
+        <w:rPr>
+          <w:rFonts w:ascii="Times New Roman" w:hAnsi="Times New Roman" w:cs="Times New Roman"/>
+          <w:b/>
+          <w:bCs/>
+          <w:highlight w:val="yellow"/>
+          <w:lang w:val="tr-TR"/>
+        </w:rPr>
+        <w:t xml:space="preserve">Shutter id: 2689872167</w:t>
+      </w:r>
     </w:p>
     <w:p>
       <w:pPr>
@@ -3459,85 +3433,59 @@
         </w:rPr>
       </w:pPr>
     </w:p>
-    <w:tbl>
-      <w:tblPr>
-        <w:tblW w:w="9000" w:type="dxa"/>
+    <w:p>
+      <w:pPr>
         <w:jc w:val="center"/>
-        <w:tblBorders>
-          <w:top w:val="single" w:sz="8" w:space="0" w:color="7F7F7F"/>
-          <w:left w:val="single" w:sz="8" w:space="0" w:color="7F7F7F"/>
-          <w:bottom w:val="single" w:sz="8" w:space="0" w:color="7F7F7F"/>
-          <w:right w:val="single" w:sz="8" w:space="0" w:color="7F7F7F"/>
-        </w:tblBorders>
-      </w:tblPr>
-      <w:tblGrid>
-        <w:gridCol w:w="9000"/>
-      </w:tblGrid>
-      <w:tr>
-        <w:tc>
-          <w:tcPr>
-            <w:tcW w:w="9000" w:type="dxa"/>
-            <w:shd w:val="clear" w:color="auto" w:fill="EDEDED"/>
-          </w:tcPr>
-          <w:p>
-            <w:pPr>
-              <w:jc w:val="both"/>
-              <w:rPr>
-                <w:rFonts w:ascii="Times New Roman" w:hAnsi="Times New Roman" w:cs="Times New Roman"/>
-                <w:lang w:val="tr-TR"/>
-              </w:rPr>
-            </w:pPr>
-            <w:r>
-              <w:rPr>
-                <w:rFonts w:ascii="Times New Roman" w:hAnsi="Times New Roman" w:cs="Times New Roman"/>
-                <w:lang w:val="tr-TR"/>
-              </w:rPr>
-              <w:t xml:space="preserve">GÖRSEL ALANI (Shutterstock)</w:t>
-            </w:r>
-          </w:p>
-          <w:p>
-            <w:pPr>
-              <w:jc w:val="both"/>
-              <w:rPr>
-                <w:rFonts w:ascii="Times New Roman" w:hAnsi="Times New Roman" w:cs="Times New Roman"/>
-                <w:lang w:val="tr-TR"/>
-              </w:rPr>
-            </w:pPr>
-            <w:r>
-              <w:rPr>
-                <w:rFonts w:ascii="Times New Roman" w:hAnsi="Times New Roman" w:cs="Times New Roman"/>
-                <w:lang w:val="tr-TR"/>
-              </w:rPr>
-              <w:t xml:space="preserve">Tarif: Elmas, grafit, grafen ve fulleren (C60) yapılarının yan yana top-çubuk modelleri; her birinin altında adı (vektörel illüstrasyon).</w:t>
-            </w:r>
-          </w:p>
-          <w:p>
-            <w:pPr>
-              <w:jc w:val="both"/>
-              <w:rPr>
-                <w:rFonts w:ascii="Times New Roman" w:hAnsi="Times New Roman" w:cs="Times New Roman"/>
-                <w:lang w:val="tr-TR"/>
-              </w:rPr>
-            </w:pPr>
-            <w:r>
-              <w:rPr>
-                <w:rFonts w:ascii="Times New Roman" w:hAnsi="Times New Roman" w:cs="Times New Roman"/>
-                <w:lang w:val="tr-TR"/>
-              </w:rPr>
-              <w:t xml:space="preserve">Shutter ID: 2074189445 (vektör) — Allotropes of carbon infographic diagram (yazılar Türkçeye çevrilecek)</w:t>
-            </w:r>
-          </w:p>
-        </w:tc>
-      </w:tr>
-    </w:tbl>
+      </w:pPr>
+      <w:r>
+        <w:drawing>
+          <wp:inline xmlns:a="http://schemas.openxmlformats.org/drawingml/2006/main" xmlns:pic="http://schemas.openxmlformats.org/drawingml/2006/picture">
+            <wp:extent cx="1779749" cy="2519999"/>
+            <wp:docPr id="900014" name="Picture 900014"/>
+            <wp:cNvGraphicFramePr>
+              <a:graphicFrameLocks noChangeAspect="1"/>
+            </wp:cNvGraphicFramePr>
+            <a:graphic>
+              <a:graphicData uri="http://schemas.openxmlformats.org/drawingml/2006/picture">
+                <pic:pic>
+                  <pic:nvPicPr>
+                    <pic:cNvPr id="0" name="2074189445_d.jpg"/>
+                    <pic:cNvPicPr/>
+                  </pic:nvPicPr>
+                  <pic:blipFill>
+                    <a:blip r:embed="rId12"/>
+                    <a:stretch>
+                      <a:fillRect/>
+                    </a:stretch>
+                  </pic:blipFill>
+                  <pic:spPr>
+                    <a:xfrm>
+                      <a:off x="0" y="0"/>
+                      <a:ext cx="1779749" cy="2519999"/>
+                    </a:xfrm>
+                    <a:prstGeom prst="rect"/>
+                  </pic:spPr>
+                </pic:pic>
+              </a:graphicData>
+            </a:graphic>
+          </wp:inline>
+        </w:drawing>
+      </w:r>
+    </w:p>
     <w:p>
       <w:pPr>
-        <w:jc w:val="both"/>
-        <w:rPr>
-          <w:rFonts w:ascii="Times New Roman" w:hAnsi="Times New Roman" w:cs="Times New Roman"/>
-          <w:lang w:val="tr-TR"/>
-        </w:rPr>
-      </w:pPr>
+        <w:jc w:val="center"/>
+      </w:pPr>
+      <w:r>
+        <w:rPr>
+          <w:rFonts w:ascii="Times New Roman" w:hAnsi="Times New Roman" w:cs="Times New Roman"/>
+          <w:b/>
+          <w:bCs/>
+          <w:highlight w:val="yellow"/>
+          <w:lang w:val="tr-TR"/>
+        </w:rPr>
+        <w:t xml:space="preserve">Shutter id: 2074189445</w:t>
+      </w:r>
     </w:p>
     <w:p>
       <w:pPr>

</xml_diff>